<commit_message>
Prepare F1000 submission snapshot
</commit_message>
<xml_diff>
--- a/F1000_Cover_Letter.docx
+++ b/F1000_Cover_Letter.docx
@@ -3,32 +3,8 @@
 <w:document xmlns:wpc="http://schemas.microsoft.com/office/word/2010/wordprocessingCanvas" xmlns:mo="http://schemas.microsoft.com/office/mac/office/2008/main" xmlns:mc="http://schemas.openxmlformats.org/markup-compatibility/2006" xmlns:mv="urn:schemas-microsoft-com:mac:vml" xmlns:o="urn:schemas-microsoft-com:office:office" xmlns:r="http://schemas.openxmlformats.org/officeDocument/2006/relationships" xmlns:m="http://schemas.openxmlformats.org/officeDocument/2006/math" xmlns:v="urn:schemas-microsoft-com:vml" xmlns:wp14="http://schemas.microsoft.com/office/word/2010/wordprocessingDrawing" xmlns:wp="http://schemas.openxmlformats.org/drawingml/2006/wordprocessingDrawing" xmlns:w10="urn:schemas-microsoft-com:office:word" xmlns:w="http://schemas.openxmlformats.org/wordprocessingml/2006/main" xmlns:w14="http://schemas.microsoft.com/office/word/2010/wordml" xmlns:wpg="http://schemas.microsoft.com/office/word/2010/wordprocessingGroup" xmlns:wpi="http://schemas.microsoft.com/office/word/2010/wordprocessingInk" xmlns:wne="http://schemas.microsoft.com/office/word/2006/wordml" xmlns:wps="http://schemas.microsoft.com/office/word/2010/wordprocessingShape" mc:Ignorable="w14 wp14">
   <w:body>
     <w:p>
-      <w:pPr>
-        <w:jc w:val="center"/>
-      </w:pPr>
       <w:r>
-        <w:rPr>
-          <w:b/>
-          <w:sz w:val="28"/>
-        </w:rPr>
-        <w:t>Cover Letter</w:t>
-      </w:r>
-    </w:p>
-    <w:p>
-      <w:pPr>
-        <w:jc w:val="center"/>
-      </w:pPr>
-      <w:r>
-        <w:rPr>
-          <w:i/>
-        </w:rPr>
-        <w:t>Advanced Nma Pooling: a software tool for reproducible evidence-synthesis and modeling workflows</w:t>
-      </w:r>
-    </w:p>
-    <w:p/>
-    <w:p>
-      <w:r>
-        <w:t>Date: 06 March 2026</w:t>
+        <w:t>Date: 14 March 2026</w:t>
       </w:r>
     </w:p>
     <w:p>
@@ -38,7 +14,7 @@
     </w:p>
     <w:p>
       <w:r>
-        <w:t>Subject: Submission of software article - Advanced Nma Pooling: a software tool for reproducible evidence-synthesis and modeling workflows</w:t>
+        <w:t>Subject: Submission of software article - Advanced NMA Pooling v0.1.1</w:t>
       </w:r>
     </w:p>
     <w:p>
@@ -48,29 +24,133 @@
     </w:p>
     <w:p>
       <w:r>
-        <w:t>Please consider our manuscript, "Advanced Nma Pooling: a software tool for reproducible evidence-synthesis and modeling workflows", for publication as a Software Tool Article in F1000Research.</w:t>
-        <w:br/>
-        <w:t>The manuscript is submitted on behalf of Mahmood Ahmad, Niraj Kumar, Bilaal Dar, Laiba Khan, Andrew Woo.</w:t>
+        <w:t>Please consider our manuscript, "Advanced NMA Pooling v0.1.1: a Python toolkit for reproducible network meta-analysis, bias adjustment, and non-proportional hazards workflows", for publication as a Software Tool Article in F1000Research.</w:t>
       </w:r>
     </w:p>
     <w:p>
       <w:r>
-        <w:t>Manuscript summary (from the abstract):</w:t>
-        <w:br/>
-        <w:t>- Background: Reproducible evidence-synthesis model development often requires repeated fitting, heterogeneity checks, and structured reporting outputs. Advanced Nma Pooling was prepared to support these workflows in a traceable software package.</w:t>
-        <w:br/>
-        <w:t>- Methods: The project is implemented using Python, R. The documented workflow covers data import, parameter selection, model execution, diagnostics, and export. The manuscript presents a reviewer-facing reproducibility path with explicit artifact pointers and bounded claims.</w:t>
-        <w:br/>
-        <w:t>- Results: The package supports end-to-end local workflows from input through model execution and exportable outputs, with validation evidence linked through project artifacts where available.</w:t>
-        <w:br/>
-        <w:t>- Conclusions: Advanced Nma Pooling provides a practical workflow for transparent modeling and evidence synthesis; external submission readiness depends on final public repository metadata and DOI-archived release records.</w:t>
+        <w:t>The manuscript is submitted on behalf of Mahmood Ahmad, Niraj Kumar, Bilaal Dar, Laiba Khan, and Andrew Woo.</w:t>
       </w:r>
     </w:p>
     <w:p>
       <w:r>
-        <w:t>This submission presents the software workflow, methodological scope, and reproducibility evidence in a form intended for transparent peer review.</w:t>
-        <w:br/>
-        <w:t>Repository and DOI placeholders in the manuscript will be replaced with final links after release archival.</w:t>
+        <w:t>This submission was prepared with the recurring themes of real F1000 software-tool peer review in mind. In particular, we have aimed to avoid the common weaknesses seen in early software manuscripts: skeleton Methods/Results sections, unclear comparison with existing open tools, insufficient reproducibility detail, unsupported performance claims, and poor separation between implemented functionality and demonstrated validation evidence.</w:t>
+      </w:r>
+    </w:p>
+    <w:p>
+      <w:r>
+        <w:t>The manuscript therefore emphasizes four points:</w:t>
+      </w:r>
+    </w:p>
+    <w:p>
+      <w:pPr>
+        <w:pStyle w:val="ListBullet"/>
+      </w:pPr>
+      <w:r>
+        <w:t>It describes the implemented package scope clearly, but limits quantitative claims to the workflows actually evidenced in the article.</w:t>
+      </w:r>
+    </w:p>
+    <w:p>
+      <w:pPr>
+        <w:pStyle w:val="ListBullet"/>
+      </w:pPr>
+      <w:r>
+        <w:t xml:space="preserve">It ties the reported results to explicit generated artifacts in the release tree, namely </w:t>
+      </w:r>
+      <w:r>
+        <w:rPr>
+          <w:rFonts w:ascii="Consolas" w:hAnsi="Consolas"/>
+        </w:rPr>
+        <w:t>artifacts/publication-suite.json</w:t>
+      </w:r>
+      <w:r>
+        <w:t xml:space="preserve">, </w:t>
+      </w:r>
+      <w:r>
+        <w:rPr>
+          <w:rFonts w:ascii="Consolas" w:hAnsi="Consolas"/>
+        </w:rPr>
+        <w:t>artifacts/publication-summary.md</w:t>
+      </w:r>
+      <w:r>
+        <w:t xml:space="preserve">, </w:t>
+      </w:r>
+      <w:r>
+        <w:rPr>
+          <w:rFonts w:ascii="Consolas" w:hAnsi="Consolas"/>
+        </w:rPr>
+        <w:t>artifacts/paper1-bundle/manifest.json</w:t>
+      </w:r>
+      <w:r>
+        <w:t xml:space="preserve">, and </w:t>
+      </w:r>
+      <w:r>
+        <w:rPr>
+          <w:rFonts w:ascii="Consolas" w:hAnsi="Consolas"/>
+        </w:rPr>
+        <w:t>artifacts/paper1-bundle/paper1-executive-summary.md</w:t>
+      </w:r>
+      <w:r>
+        <w:t>.</w:t>
+      </w:r>
+    </w:p>
+    <w:p>
+      <w:pPr>
+        <w:pStyle w:val="ListBullet"/>
+      </w:pPr>
+      <w:r>
+        <w:t xml:space="preserve">It documents a public source repository for release </w:t>
+      </w:r>
+      <w:r>
+        <w:rPr>
+          <w:rFonts w:ascii="Consolas" w:hAnsi="Consolas"/>
+        </w:rPr>
+        <w:t>v0.1.1</w:t>
+      </w:r>
+      <w:r>
+        <w:t xml:space="preserve"> and the corresponding release provenance anchored at commit </w:t>
+      </w:r>
+      <w:r>
+        <w:rPr>
+          <w:rFonts w:ascii="Consolas" w:hAnsi="Consolas"/>
+        </w:rPr>
+        <w:t>d7b61ea98be6ee6ce11e61ed6b391a2675bf5c0a</w:t>
+      </w:r>
+      <w:r>
+        <w:t>.</w:t>
+      </w:r>
+    </w:p>
+    <w:p>
+      <w:pPr>
+        <w:pStyle w:val="ListBullet"/>
+      </w:pPr>
+      <w:r>
+        <w:t>It states current limitations directly, including the present restriction of this draft to publication-suite and paper-bundle evidence, the continuous-only ML-NMR implementation, and the fact that DOI-backed archival through Zenodo remains pending even though the exact manuscript-result artifacts are now included in a public GitHub submission snapshot.</w:t>
+      </w:r>
+    </w:p>
+    <w:p>
+      <w:r>
+        <w:t>In brief, the manuscript reports an open-source Python package that integrates aggregate-data network meta-analysis, ML-NMR-style AD+IPD workflows, design-stratified bias adjustment, and survival non-proportional hazards workflows under a config-driven reproducibility layer. The article does not claim that every implemented module has a full standalone case study in this paper. Instead, it presents quantitative results from the publication suite and the paper bundle, supported by the release-tree artifacts and the current automated validation evidence.</w:t>
+      </w:r>
+    </w:p>
+    <w:p>
+      <w:r>
+        <w:t>The public source repository is: https://github.com/mahmood726-cyber/advanced-nma-pooling</w:t>
+      </w:r>
+    </w:p>
+    <w:p>
+      <w:r>
+        <w:t>The current release analyzed in the manuscript is: https://github.com/mahmood726-cyber/advanced-nma-pooling/tree/v0.1.1</w:t>
+      </w:r>
+    </w:p>
+    <w:p>
+      <w:r>
+        <w:t>The public GitHub submission snapshot containing the revised manuscript package and exact generated result files is: https://github.com/mahmood726-cyber/advanced-nma-pooling/tree/f1000-submission-2026-03-14</w:t>
+      </w:r>
+    </w:p>
+    <w:p>
+      <w:r>
+        <w:t>The remaining publication-facing gap is DOI-backed archival packaging. The manuscript now points to the public GitHub submission snapshot, and Zenodo DOI generation for that frozen snapshot remains pending. That is an explicit limitation rather than an omitted dependency.</w:t>
       </w:r>
     </w:p>
     <w:p>
@@ -80,19 +160,12 @@
     </w:p>
     <w:p>
       <w:r>
-        <w:t>Sincerely,</w:t>
-        <w:br/>
-        <w:t>Mahmood Ahmad</w:t>
-        <w:br/>
-        <w:t>Royal Free Hospital</w:t>
-        <w:br/>
-        <w:t>mahmood.ahmad2@nhs.net</w:t>
+        <w:t>Sincerely, Mahmood Ahmad Royal Free Hospital mahmood.ahmad2@nhs.net</w:t>
       </w:r>
     </w:p>
     <w:p>
       <w:r>
-        <w:t>Manuscript corresponding author listed in paper: Corresponding author: Andrew Woo (andy2709w@gmail.com)</w:t>
-        <w:br/>
+        <w:t>Corresponding author listed in manuscript: Mahmood Ahmad (mahmood.ahmad2@nhs.net)</w:t>
       </w:r>
     </w:p>
     <w:sectPr>
@@ -469,7 +542,7 @@
     <w:qFormat/>
     <w:rsid w:val="00FC693F"/>
     <w:rPr>
-      <w:rFonts w:ascii="Calibri" w:hAnsi="Calibri"/>
+      <w:rFonts w:ascii="Times New Roman" w:hAnsi="Times New Roman"/>
       <w:sz w:val="22"/>
     </w:rPr>
   </w:style>
@@ -12154,6 +12227,13 @@
         <w:shd w:val="clear" w:color="auto" w:fill="FBCAA2" w:themeFill="accent6" w:themeFillTint="7F"/>
       </w:tcPr>
     </w:tblStylePr>
+  </w:style>
+  <w:style w:type="paragraph" w:customStyle="1" w:styleId="CodeBlock">
+    <w:name w:val="Code Block"/>
+    <w:rPr>
+      <w:rFonts w:ascii="Consolas" w:hAnsi="Consolas"/>
+      <w:sz w:val="18"/>
+    </w:rPr>
   </w:style>
 </w:styles>
 </file>

</xml_diff>

<commit_message>
Tighten F1000 submission package
</commit_message>
<xml_diff>
--- a/F1000_Cover_Letter.docx
+++ b/F1000_Cover_Letter.docx
@@ -91,6 +91,24 @@
         <w:t>artifacts/paper1-bundle/paper1-executive-summary.md</w:t>
       </w:r>
       <w:r>
+        <w:t xml:space="preserve">, and it now packages copied release provenance files in </w:t>
+      </w:r>
+      <w:r>
+        <w:rPr>
+          <w:rFonts w:ascii="Consolas" w:hAnsi="Consolas"/>
+        </w:rPr>
+        <w:t>f1000_artifacts/release-manifest-v0.1.1.json</w:t>
+      </w:r>
+      <w:r>
+        <w:t xml:space="preserve"> and </w:t>
+      </w:r>
+      <w:r>
+        <w:rPr>
+          <w:rFonts w:ascii="Consolas" w:hAnsi="Consolas"/>
+        </w:rPr>
+        <w:t>f1000_artifacts/SHA256SUMS-v0.1.1.txt</w:t>
+      </w:r>
+      <w:r>
         <w:t>.</w:t>
       </w:r>
     </w:p>
@@ -125,7 +143,7 @@
         <w:pStyle w:val="ListBullet"/>
       </w:pPr>
       <w:r>
-        <w:t>It states current limitations directly, including the present restriction of this draft to publication-suite and paper-bundle evidence, the continuous-only ML-NMR implementation, and the fact that DOI-backed archival through Zenodo remains pending even though the exact manuscript-result artifacts and aligned figure package are now included in a public GitHub submission snapshot.</w:t>
+        <w:t>It states current limitations directly, including the present restriction of this draft to publication-suite and paper-bundle evidence, the continuous-only ML-NMR implementation, and the fact that DOI-backed archival through Zenodo remains pending even though the exact manuscript-result artifacts, copied release provenance files, and aligned figure package are now included in a public GitHub submission snapshot.</w:t>
       </w:r>
     </w:p>
     <w:p>
@@ -145,7 +163,7 @@
     </w:p>
     <w:p>
       <w:r>
-        <w:t>The public GitHub submission snapshot containing the revised manuscript package and exact generated result files is: https://github.com/mahmood726-cyber/advanced-nma-pooling/tree/f1000-submission-2026-03-14-final</w:t>
+        <w:t>The public GitHub submission snapshot containing the revised manuscript package, exact generated result files, and copied release provenance files is: https://github.com/mahmood726-cyber/advanced-nma-pooling/tree/f1000-submission-2026-03-14-r2</w:t>
       </w:r>
     </w:p>
     <w:p>

</xml_diff>